<commit_message>
Refactor learning workspace into a unified dashboard experience
</commit_message>
<xml_diff>
--- a/static/downloads/Adetola Olumide_Active Voice and Passive Voice_AI_Study_Notes.docx
+++ b/static/downloads/Adetola Olumide_Active Voice and Passive Voice_AI_Study_Notes.docx
@@ -91,115 +91,111 @@
     </w:p>
     <w:p>
       <w:r>
-        <w:t xml:space="preserve">Let’s work through active and passive voice together—it’s a super useful skill in writing and speaking clearly. </w:t>
+        <w:t>Let’s work through active and passive voice together. At first, it might seem like just grammar rules, but once you get it, it helps you write and understand sentences much better.</w:t>
         <w:br/>
         <w:br/>
-        <w:t>### 💡 What’s the Big Idea?</w:t>
+        <w:t>### 💡 The Big Idea</w:t>
         <w:br/>
         <w:br/>
-        <w:t>Active voice means the subject is doing the action. Like “The chef cooked the meal.” Here, the chef (subject) is doing the cooking (verb). It’s straightforward and shows who’s in charge of the action.</w:t>
+        <w:t>Active voice happens when **the subject does the action**. Think of the subject as the “doer.” For example: "The teacher explained the lesson." Here, **the teacher** is doing the explaining.</w:t>
         <w:br/>
         <w:br/>
-        <w:t>Passive voice flips this. The subject is receiving the action, not doing it. So instead of "The chef cooked the meal," you say “The meal was cooked by the chef.” The focus is on what happened to the meal, not who did it.</w:t>
+        <w:t>Passive voice happens when **the subject receives the action**. Instead of focusing on who’s doing it, the sentence focuses on what’s happening to the subject. Like: "The lesson was explained by the teacher." Now, the lesson is getting the action done.</w:t>
         <w:br/>
         <w:br/>
-        <w:t>That switch can change the focus of your sentence. And don’t worry—this might feel tricky at first, but once you see how to move parts around, it’ll click.</w:t>
+        <w:t xml:space="preserve">So, active voice = doer doing something.  </w:t>
+        <w:br/>
+        <w:t>Passive voice = focus on what is done, sometimes hiding the doer.</w:t>
+        <w:br/>
+        <w:br/>
+        <w:t>Don’t worry if this feels tricky now—it clicks quickly once you see a few examples.</w:t>
+        <w:br/>
+        <w:br/>
+        <w:t>### 🌍 Let’s Picture It</w:t>
+        <w:br/>
+        <w:br/>
+        <w:t>Imagine you’re watching a soccer game. If you say, "The player kicked the ball," that’s active voice—player is doing something. But if you say, "The ball was kicked by the player," the ball is the subject and receives the action. It’s just two ways of telling the story.</w:t>
+        <w:br/>
+        <w:br/>
+        <w:t>### 🤔 Pause and Think</w:t>
+        <w:br/>
+        <w:br/>
+        <w:t>If you hear the sentence, "The cake was baked," who is doing the baking? Is it clear in that sentence? Why might someone want to say it like this?</w:t>
         <w:br/>
         <w:br/>
         <w:t>---</w:t>
         <w:br/>
         <w:br/>
-        <w:t>### 🌍 Let’s Picture It Like a Play</w:t>
+        <w:t>### ✅ Understanding the Answer</w:t>
         <w:br/>
         <w:br/>
-        <w:t>Imagine a stage where actors perform actions. In active voice, the actor (subject) steps forward and does something: “The students completed the assignment.” The students are the stars.</w:t>
-        <w:br/>
-        <w:br/>
-        <w:t>In passive voice, the spotlight moves to the thing receiving the action, like a prop. So instead of “The students completed the assignment,” the stage focuses on the assignment itself: “The assignment was completed by the students.” Now the assignment is center stage.</w:t>
+        <w:t>If you said—it’s not clear who baked the cake—that’s right! The passive voice sometimes leaves out or hides the doer, either because we don't know or it's not important. Maybe only the action matters.</w:t>
         <w:br/>
         <w:br/>
         <w:t>---</w:t>
         <w:br/>
         <w:br/>
-        <w:t>### 🤔 Pause and think</w:t>
+        <w:t>### 💡 One Worked Example</w:t>
         <w:br/>
         <w:br/>
-        <w:t>If I say, “The assignment was submitted by Lisa,” what’s the focus—the person or the assignment?</w:t>
+        <w:t>Let’s convert an active sentence to passive:</w:t>
+        <w:br/>
+        <w:br/>
+        <w:t>Active: "The students wrote the exam."</w:t>
+        <w:br/>
+        <w:br/>
+        <w:t>Step 1: Identify object = "the exam."</w:t>
+        <w:br/>
+        <w:br/>
+        <w:t>Step 2: Move “the exam” to subject position: "The exam..."</w:t>
+        <w:br/>
+        <w:br/>
+        <w:t>Step 3: Add a form of “be” (based on tense, here past tense → "was") and past participle of the verb (“write” → "written").</w:t>
+        <w:br/>
+        <w:br/>
+        <w:t>Step 4: Include the doer using “by” if necessary: "by the students."</w:t>
+        <w:br/>
+        <w:br/>
+        <w:t>Result: "The exam was written by the students."</w:t>
+        <w:br/>
+        <w:br/>
+        <w:t>See? We just shifted who is emphasized—from “students” doing the action to “exam” receiving it.</w:t>
         <w:br/>
         <w:br/>
         <w:t>---</w:t>
         <w:br/>
         <w:br/>
-        <w:t>### ✅ Here’s the answer</w:t>
+        <w:t>### ⚠ Where Students Usually Get Stuck</w:t>
         <w:br/>
         <w:br/>
-        <w:t>The focus is on the assignment because it’s the subject. The sentence highlights what happened to it. Lisa is still important, but she’s placed after “by,” making her less of the star.</w:t>
+        <w:t xml:space="preserve">One common mistake is forgetting to change the verb properly when switching to passive. For example, forgetting to use “was” or using the base verb “write” instead of the past participle “written.” </w:t>
+        <w:br/>
+        <w:br/>
+        <w:t>A simple trick: Always pair the past participle with a form of “be” (am, is, are, was, were, etc.) in the passive voice.</w:t>
         <w:br/>
         <w:br/>
         <w:t>---</w:t>
         <w:br/>
         <w:br/>
-        <w:t>### 💡 One way to convert active to passive</w:t>
+        <w:t>### 🎯 Your Turn</w:t>
         <w:br/>
         <w:br/>
-        <w:t>Let’s try changing “The students wrote the exam” into passive.</w:t>
+        <w:t>Try changing this active sentence to passive:</w:t>
         <w:br/>
         <w:br/>
-        <w:t>Step 1: Move the object (“the exam”) to the start, making it the new subject.</w:t>
+        <w:t>“The chef cooked the meal.”</w:t>
         <w:br/>
         <w:br/>
-        <w:t>Step 2: Add the correct form of the verb “be.” Since “wrote” is past tense, use “was.”</w:t>
-        <w:br/>
-        <w:br/>
-        <w:t>Step 3: Use the past participle of the verb “written.”</w:t>
-        <w:br/>
-        <w:br/>
-        <w:t>Step 4: Add “by the students” to show who did the action.</w:t>
-        <w:br/>
-        <w:br/>
-        <w:t>The result: “The exam was written by the students.”</w:t>
-        <w:br/>
-        <w:br/>
-        <w:t>Try saying both out loud to feel the difference.</w:t>
+        <w:t>Take your time and think about the object to subject switch, the correct verb form, and whether you want to include “by the chef.”</w:t>
         <w:br/>
         <w:br/>
         <w:t>---</w:t>
         <w:br/>
         <w:br/>
-        <w:t>### ⚠ Common mistakes here</w:t>
+        <w:t>### 🚀 Finish Like a Tutor</w:t>
         <w:br/>
         <w:br/>
-        <w:t>- Forgetting to change the verb correctly. For example, don’t say “The exam wrote by the students.” You always need “was written” (be + past participle).</w:t>
-        <w:br/>
-        <w:br/>
-        <w:t>- Leaving out “by the...” phrase. Sometimes it’s okay if you don’t know or don’t want to say who did the action, but if you want to include the doer, use “by.”</w:t>
-        <w:br/>
-        <w:br/>
-        <w:t>A quick trick: Remember passive is like a team effort—the subject receives the action, so it needs help from “be” verbs, like am, is, are, was, were.</w:t>
-        <w:br/>
-        <w:br/>
-        <w:t>---</w:t>
-        <w:br/>
-        <w:br/>
-        <w:t>### 🎯 Your turn</w:t>
-        <w:br/>
-        <w:br/>
-        <w:t>Try converting this sentence to passive:</w:t>
-        <w:br/>
-        <w:br/>
-        <w:t>“The chef prepared the meal.”</w:t>
-        <w:br/>
-        <w:br/>
-        <w:t>Take your time and think about the steps!</w:t>
-        <w:br/>
-        <w:br/>
-        <w:t>---</w:t>
-        <w:br/>
-        <w:br/>
-        <w:t>### 🚀 Almost there!</w:t>
-        <w:br/>
-        <w:br/>
-        <w:t>Once you’re comfortable switching between active and passive, you’ll notice writing and understanding English sentences gets way clearer. Try the practice questions next and see how well you can spot and change voices. I bet you’ll do great!</w:t>
+        <w:t>Once you’re comfortable changing sentences between active and passive, try spotting the voice in your favorite book or show subtitles. It’s a fun way to practice! I think you’re ready to tackle those exercises now.</w:t>
       </w:r>
     </w:p>
     <w:p>

</xml_diff>